<commit_message>
feat(auth): route tenants to the portal by default after sign-in
Added /post-login as the single landing spot for every sign-in method. It
checks the account's role server-side and forwards tenants to /portal and
landlords to /dashboard, so tenants never see the landlord dashboard flash
and landlords never see the portal.

Credentials sign-in, Google sign-in, and registration all now point at
/post-login instead of /dashboard (registration always lands on the
dashboard anyway, since new accounts are landlords  the redirect just keeps
the path consistent).

This replaces the unreliable client-side session fetch that previously
tried to pick the destination in the browser.
</commit_message>
<xml_diff>
--- a/RentaPH_Landlord_Guide.docx
+++ b/RentaPH_Landlord_Guide.docx
@@ -162,22 +162,20 @@
     </w:p>
     <w:p>
       <w:pPr>
-        <w:shd w:val="clear" w:color="auto" w:fill="FFF3CD"/>
+        <w:pStyle w:val="ListNumber"/>
+        <w:rPr>
+          <w:rFonts w:cs="Calibri"/>
+        </w:rPr>
+      </w:pPr>
+      <w:r>
         <w:rPr>
           <w:rFonts w:cs="Calibri"/>
           <w:b/>
           <w:color w:val="856404"/>
         </w:rPr>
-      </w:pPr>
-      <w:r>
-        <w:rPr>
-          <w:rFonts w:cs="Calibri"/>
-          <w:b/>
-          <w:color w:val="856404"/>
-        </w:rPr>
         <w:lastRenderedPageBreak/>
         <w:drawing>
-          <wp:inline distT="0" distB="0" distL="0" distR="0" wp14:anchorId="10A70F37" wp14:editId="75A66E3D">
+          <wp:inline distT="0" distB="0" distL="0" distR="0" wp14:anchorId="3ECCEB6A" wp14:editId="5A094953">
             <wp:extent cx="5943600" cy="3547745"/>
             <wp:effectExtent l="0" t="0" r="0" b="0"/>
             <wp:docPr id="709870361" name="Picture 1"/>
@@ -215,39 +213,47 @@
     </w:p>
     <w:p>
       <w:pPr>
-        <w:shd w:val="clear" w:color="auto" w:fill="FFF3CD"/>
+        <w:pStyle w:val="ListNumber"/>
+        <w:rPr>
+          <w:rFonts w:cs="Calibri"/>
+          <w:b/>
+          <w:bCs/>
+        </w:rPr>
+      </w:pPr>
+    </w:p>
+    <w:p>
+      <w:pPr>
+        <w:pStyle w:val="ListNumber"/>
+        <w:rPr>
+          <w:rFonts w:cs="Calibri"/>
+          <w:b/>
+          <w:bCs/>
+        </w:rPr>
+      </w:pPr>
+      <w:r>
+        <w:rPr>
+          <w:rFonts w:cs="Calibri"/>
+          <w:b/>
+          <w:bCs/>
+        </w:rPr>
+        <w:t>Email verification screen</w:t>
+      </w:r>
+    </w:p>
+    <w:p>
+      <w:pPr>
+        <w:pStyle w:val="ListNumber"/>
+        <w:rPr>
+          <w:rFonts w:cs="Calibri"/>
+        </w:rPr>
+      </w:pPr>
+      <w:r>
         <w:rPr>
           <w:rFonts w:cs="Calibri"/>
           <w:b/>
           <w:color w:val="856404"/>
         </w:rPr>
-      </w:pPr>
-    </w:p>
-    <w:p>
-      <w:pPr>
-        <w:shd w:val="clear" w:color="auto" w:fill="FFF3CD"/>
-        <w:rPr>
-          <w:rFonts w:cs="Calibri"/>
-          <w:b/>
-          <w:color w:val="856404"/>
-        </w:rPr>
-      </w:pPr>
-      <w:r>
-        <w:rPr>
-          <w:rFonts w:cs="Calibri"/>
-          <w:b/>
-          <w:color w:val="856404"/>
-        </w:rPr>
-        <w:t>Email Verification Screen</w:t>
-      </w:r>
-      <w:r>
-        <w:rPr>
-          <w:rFonts w:cs="Calibri"/>
-          <w:b/>
-          <w:color w:val="856404"/>
-        </w:rPr>
         <w:drawing>
-          <wp:inline distT="0" distB="0" distL="0" distR="0" wp14:anchorId="1A61CC19" wp14:editId="7E5AD4BD">
+          <wp:inline distT="0" distB="0" distL="0" distR="0" wp14:anchorId="1726EA83" wp14:editId="7EF3889F">
             <wp:extent cx="5943600" cy="3585210"/>
             <wp:effectExtent l="0" t="0" r="0" b="0"/>
             <wp:docPr id="140926837" name="Picture 1"/>
@@ -285,6 +291,14 @@
     </w:p>
     <w:p>
       <w:pPr>
+        <w:pStyle w:val="ListNumber"/>
+        <w:rPr>
+          <w:rFonts w:cs="Calibri"/>
+        </w:rPr>
+      </w:pPr>
+    </w:p>
+    <w:p>
+      <w:pPr>
         <w:pStyle w:val="Heading3"/>
         <w:rPr>
           <w:rFonts w:cs="Calibri"/>
@@ -294,6 +308,7 @@
         <w:rPr>
           <w:rFonts w:cs="Calibri"/>
         </w:rPr>
+        <w:lastRenderedPageBreak/>
         <w:t>1.2 Your dashboard</w:t>
       </w:r>
     </w:p>
@@ -307,7 +322,6 @@
         <w:rPr>
           <w:rFonts w:cs="Calibri"/>
         </w:rPr>
-        <w:lastRenderedPageBreak/>
         <w:t>After signing in you land on the Dashboard, which shows:</w:t>
       </w:r>
     </w:p>
@@ -1368,19 +1382,59 @@
     </w:p>
     <w:p>
       <w:pPr>
-        <w:shd w:val="clear" w:color="auto" w:fill="FFF3CD"/>
-        <w:rPr>
-          <w:rFonts w:cs="Calibri"/>
-        </w:rPr>
-      </w:pPr>
-      <w:r>
-        <w:rPr>
-          <w:rFonts w:cs="Calibri"/>
-          <w:b/>
-          <w:color w:val="856404"/>
-        </w:rPr>
-        <w:t>[Screenshot: Record payment dialog with lease, amount, method, reference]</w:t>
-      </w:r>
+        <w:pStyle w:val="ListNumber"/>
+        <w:rPr>
+          <w:rFonts w:cs="Calibri"/>
+        </w:rPr>
+      </w:pPr>
+      <w:r>
+        <w:rPr>
+          <w:rFonts w:cs="Calibri"/>
+        </w:rPr>
+        <w:drawing>
+          <wp:inline distT="0" distB="0" distL="0" distR="0" wp14:anchorId="2D43116C" wp14:editId="378CF587">
+            <wp:extent cx="5943600" cy="2852420"/>
+            <wp:effectExtent l="0" t="0" r="0" b="0"/>
+            <wp:docPr id="223858301" name="Picture 1"/>
+            <wp:cNvGraphicFramePr>
+              <a:graphicFrameLocks xmlns:a="http://schemas.openxmlformats.org/drawingml/2006/main" noChangeAspect="1"/>
+            </wp:cNvGraphicFramePr>
+            <a:graphic xmlns:a="http://schemas.openxmlformats.org/drawingml/2006/main">
+              <a:graphicData uri="http://schemas.openxmlformats.org/drawingml/2006/picture">
+                <pic:pic xmlns:pic="http://schemas.openxmlformats.org/drawingml/2006/picture">
+                  <pic:nvPicPr>
+                    <pic:cNvPr id="223858301" name=""/>
+                    <pic:cNvPicPr/>
+                  </pic:nvPicPr>
+                  <pic:blipFill>
+                    <a:blip r:embed="rId14"/>
+                    <a:stretch>
+                      <a:fillRect/>
+                    </a:stretch>
+                  </pic:blipFill>
+                  <pic:spPr>
+                    <a:xfrm>
+                      <a:off x="0" y="0"/>
+                      <a:ext cx="5943600" cy="2852420"/>
+                    </a:xfrm>
+                    <a:prstGeom prst="rect">
+                      <a:avLst/>
+                    </a:prstGeom>
+                  </pic:spPr>
+                </pic:pic>
+              </a:graphicData>
+            </a:graphic>
+          </wp:inline>
+        </w:drawing>
+      </w:r>
+    </w:p>
+    <w:p>
+      <w:pPr>
+        <w:pStyle w:val="ListNumber"/>
+        <w:rPr>
+          <w:rFonts w:cs="Calibri"/>
+        </w:rPr>
+      </w:pPr>
     </w:p>
     <w:p>
       <w:pPr>
@@ -1453,19 +1507,60 @@
     </w:p>
     <w:p>
       <w:pPr>
-        <w:shd w:val="clear" w:color="auto" w:fill="FFF3CD"/>
-        <w:rPr>
-          <w:rFonts w:cs="Calibri"/>
-        </w:rPr>
-      </w:pPr>
-      <w:r>
-        <w:rPr>
-          <w:rFonts w:cs="Calibri"/>
-          <w:b/>
-          <w:color w:val="856404"/>
-        </w:rPr>
-        <w:t>[Screenshot: Pending payment with Verify/Reject buttons]</w:t>
-      </w:r>
+        <w:pStyle w:val="ListNumber"/>
+        <w:rPr>
+          <w:rFonts w:cs="Calibri"/>
+        </w:rPr>
+      </w:pPr>
+      <w:r>
+        <w:rPr>
+          <w:rFonts w:cs="Calibri"/>
+        </w:rPr>
+        <w:lastRenderedPageBreak/>
+        <w:drawing>
+          <wp:inline distT="0" distB="0" distL="0" distR="0" wp14:anchorId="1AC23CD2" wp14:editId="37E3DF81">
+            <wp:extent cx="5943600" cy="2816860"/>
+            <wp:effectExtent l="0" t="0" r="0" b="0"/>
+            <wp:docPr id="127861078" name="Picture 1"/>
+            <wp:cNvGraphicFramePr>
+              <a:graphicFrameLocks xmlns:a="http://schemas.openxmlformats.org/drawingml/2006/main" noChangeAspect="1"/>
+            </wp:cNvGraphicFramePr>
+            <a:graphic xmlns:a="http://schemas.openxmlformats.org/drawingml/2006/main">
+              <a:graphicData uri="http://schemas.openxmlformats.org/drawingml/2006/picture">
+                <pic:pic xmlns:pic="http://schemas.openxmlformats.org/drawingml/2006/picture">
+                  <pic:nvPicPr>
+                    <pic:cNvPr id="127861078" name=""/>
+                    <pic:cNvPicPr/>
+                  </pic:nvPicPr>
+                  <pic:blipFill>
+                    <a:blip r:embed="rId15"/>
+                    <a:stretch>
+                      <a:fillRect/>
+                    </a:stretch>
+                  </pic:blipFill>
+                  <pic:spPr>
+                    <a:xfrm>
+                      <a:off x="0" y="0"/>
+                      <a:ext cx="5943600" cy="2816860"/>
+                    </a:xfrm>
+                    <a:prstGeom prst="rect">
+                      <a:avLst/>
+                    </a:prstGeom>
+                  </pic:spPr>
+                </pic:pic>
+              </a:graphicData>
+            </a:graphic>
+          </wp:inline>
+        </w:drawing>
+      </w:r>
+    </w:p>
+    <w:p>
+      <w:pPr>
+        <w:pStyle w:val="ListNumber"/>
+        <w:rPr>
+          <w:rFonts w:cs="Calibri"/>
+        </w:rPr>
+      </w:pPr>
     </w:p>
     <w:p>
       <w:pPr>
@@ -1538,19 +1633,60 @@
     </w:p>
     <w:p>
       <w:pPr>
-        <w:shd w:val="clear" w:color="auto" w:fill="FFF3CD"/>
-        <w:rPr>
-          <w:rFonts w:cs="Calibri"/>
-        </w:rPr>
-      </w:pPr>
-      <w:r>
-        <w:rPr>
-          <w:rFonts w:cs="Calibri"/>
-          <w:b/>
-          <w:color w:val="856404"/>
-        </w:rPr>
-        <w:t>[Screenshot: Statement of account table with periods and columns]</w:t>
-      </w:r>
+        <w:pStyle w:val="ListBullet"/>
+        <w:rPr>
+          <w:rFonts w:ascii="Calibri" w:cs="Calibri"/>
+        </w:rPr>
+      </w:pPr>
+      <w:r>
+        <w:rPr>
+          <w:rFonts w:ascii="Calibri" w:cs="Calibri"/>
+        </w:rPr>
+        <w:lastRenderedPageBreak/>
+        <w:drawing>
+          <wp:inline distT="0" distB="0" distL="0" distR="0" wp14:anchorId="4A4CB4B4" wp14:editId="7E06420C">
+            <wp:extent cx="5943600" cy="3292475"/>
+            <wp:effectExtent l="0" t="0" r="0" b="0"/>
+            <wp:docPr id="1299792171" name="Picture 1"/>
+            <wp:cNvGraphicFramePr>
+              <a:graphicFrameLocks xmlns:a="http://schemas.openxmlformats.org/drawingml/2006/main" noChangeAspect="1"/>
+            </wp:cNvGraphicFramePr>
+            <a:graphic xmlns:a="http://schemas.openxmlformats.org/drawingml/2006/main">
+              <a:graphicData uri="http://schemas.openxmlformats.org/drawingml/2006/picture">
+                <pic:pic xmlns:pic="http://schemas.openxmlformats.org/drawingml/2006/picture">
+                  <pic:nvPicPr>
+                    <pic:cNvPr id="1299792171" name=""/>
+                    <pic:cNvPicPr/>
+                  </pic:nvPicPr>
+                  <pic:blipFill>
+                    <a:blip r:embed="rId16"/>
+                    <a:stretch>
+                      <a:fillRect/>
+                    </a:stretch>
+                  </pic:blipFill>
+                  <pic:spPr>
+                    <a:xfrm>
+                      <a:off x="0" y="0"/>
+                      <a:ext cx="5943600" cy="3292475"/>
+                    </a:xfrm>
+                    <a:prstGeom prst="rect">
+                      <a:avLst/>
+                    </a:prstGeom>
+                  </pic:spPr>
+                </pic:pic>
+              </a:graphicData>
+            </a:graphic>
+          </wp:inline>
+        </w:drawing>
+      </w:r>
+    </w:p>
+    <w:p>
+      <w:pPr>
+        <w:pStyle w:val="ListBullet"/>
+        <w:rPr>
+          <w:rFonts w:ascii="Calibri" w:cs="Calibri"/>
+        </w:rPr>
+      </w:pPr>
     </w:p>
     <w:p>
       <w:pPr>
@@ -1632,24 +1768,70 @@
         <w:rPr>
           <w:rFonts w:ascii="Calibri" w:cs="Calibri"/>
         </w:rPr>
+        <w:t>Use the manual button to nudge earlier or resend after a tenant ignores the first reminder.</w:t>
+      </w:r>
+    </w:p>
+    <w:p>
+      <w:pPr>
+        <w:pStyle w:val="ListBullet"/>
+        <w:rPr>
+          <w:rFonts w:ascii="Calibri" w:cs="Calibri"/>
+        </w:rPr>
+      </w:pPr>
+      <w:r>
+        <w:rPr>
+          <w:rFonts w:ascii="Calibri" w:cs="Calibri"/>
+          <w:noProof/>
+        </w:rPr>
         <w:lastRenderedPageBreak/>
-        <w:t>Use the manual button to nudge earlier or resend after a tenant ignores the first reminder.</w:t>
-      </w:r>
-    </w:p>
-    <w:p>
-      <w:pPr>
-        <w:shd w:val="clear" w:color="auto" w:fill="FFF3CD"/>
-        <w:rPr>
-          <w:rFonts w:cs="Calibri"/>
-        </w:rPr>
-      </w:pPr>
-      <w:r>
-        <w:rPr>
-          <w:rFonts w:cs="Calibri"/>
-          <w:b/>
-          <w:color w:val="856404"/>
-        </w:rPr>
-        <w:t>[Screenshot: Dashboard rent-due-soon card with Send reminder buttons]</w:t>
+        <w:drawing>
+          <wp:inline distT="0" distB="0" distL="0" distR="0" wp14:anchorId="7D88F989" wp14:editId="17BAC5ED">
+            <wp:extent cx="5939790" cy="3864610"/>
+            <wp:effectExtent l="0" t="0" r="0" b="0"/>
+            <wp:docPr id="1636876777" name="Picture 2"/>
+            <wp:cNvGraphicFramePr>
+              <a:graphicFrameLocks xmlns:a="http://schemas.openxmlformats.org/drawingml/2006/main" noChangeAspect="1"/>
+            </wp:cNvGraphicFramePr>
+            <a:graphic xmlns:a="http://schemas.openxmlformats.org/drawingml/2006/main">
+              <a:graphicData uri="http://schemas.openxmlformats.org/drawingml/2006/picture">
+                <pic:pic xmlns:pic="http://schemas.openxmlformats.org/drawingml/2006/picture">
+                  <pic:nvPicPr>
+                    <pic:cNvPr id="0" name="Picture 2"/>
+                    <pic:cNvPicPr>
+                      <a:picLocks noChangeAspect="1" noChangeArrowheads="1"/>
+                    </pic:cNvPicPr>
+                  </pic:nvPicPr>
+                  <pic:blipFill>
+                    <a:blip r:embed="rId17">
+                      <a:extLst>
+                        <a:ext uri="{28A0092B-C50C-407E-A947-70E740481C1C}">
+                          <a14:useLocalDpi xmlns:a14="http://schemas.microsoft.com/office/drawing/2010/main" val="0"/>
+                        </a:ext>
+                      </a:extLst>
+                    </a:blip>
+                    <a:srcRect/>
+                    <a:stretch>
+                      <a:fillRect/>
+                    </a:stretch>
+                  </pic:blipFill>
+                  <pic:spPr bwMode="auto">
+                    <a:xfrm>
+                      <a:off x="0" y="0"/>
+                      <a:ext cx="5939790" cy="3864610"/>
+                    </a:xfrm>
+                    <a:prstGeom prst="rect">
+                      <a:avLst/>
+                    </a:prstGeom>
+                    <a:noFill/>
+                    <a:ln>
+                      <a:noFill/>
+                    </a:ln>
+                  </pic:spPr>
+                </pic:pic>
+              </a:graphicData>
+            </a:graphic>
+          </wp:inline>
+        </w:drawing>
       </w:r>
     </w:p>
     <w:p>
@@ -1724,18 +1906,50 @@
     </w:p>
     <w:p>
       <w:pPr>
-        <w:shd w:val="clear" w:color="auto" w:fill="FFF3CD"/>
-        <w:rPr>
-          <w:rFonts w:cs="Calibri"/>
-        </w:rPr>
-      </w:pPr>
-      <w:r>
-        <w:rPr>
-          <w:rFonts w:cs="Calibri"/>
-          <w:b/>
-          <w:color w:val="856404"/>
-        </w:rPr>
-        <w:t>[Screenshot: Add meter form with type, label, rate]</w:t>
+        <w:pStyle w:val="ListNumber"/>
+        <w:rPr>
+          <w:rFonts w:cs="Calibri"/>
+        </w:rPr>
+      </w:pPr>
+      <w:r>
+        <w:rPr>
+          <w:rFonts w:cs="Calibri"/>
+        </w:rPr>
+        <w:drawing>
+          <wp:inline distT="0" distB="0" distL="0" distR="0" wp14:anchorId="4B7C673D" wp14:editId="35C3FAF2">
+            <wp:extent cx="5943600" cy="2324100"/>
+            <wp:effectExtent l="0" t="0" r="0" b="0"/>
+            <wp:docPr id="1917597677" name="Picture 1"/>
+            <wp:cNvGraphicFramePr>
+              <a:graphicFrameLocks xmlns:a="http://schemas.openxmlformats.org/drawingml/2006/main" noChangeAspect="1"/>
+            </wp:cNvGraphicFramePr>
+            <a:graphic xmlns:a="http://schemas.openxmlformats.org/drawingml/2006/main">
+              <a:graphicData uri="http://schemas.openxmlformats.org/drawingml/2006/picture">
+                <pic:pic xmlns:pic="http://schemas.openxmlformats.org/drawingml/2006/picture">
+                  <pic:nvPicPr>
+                    <pic:cNvPr id="1917597677" name=""/>
+                    <pic:cNvPicPr/>
+                  </pic:nvPicPr>
+                  <pic:blipFill>
+                    <a:blip r:embed="rId18"/>
+                    <a:stretch>
+                      <a:fillRect/>
+                    </a:stretch>
+                  </pic:blipFill>
+                  <pic:spPr>
+                    <a:xfrm>
+                      <a:off x="0" y="0"/>
+                      <a:ext cx="5943600" cy="2324100"/>
+                    </a:xfrm>
+                    <a:prstGeom prst="rect">
+                      <a:avLst/>
+                    </a:prstGeom>
+                  </pic:spPr>
+                </pic:pic>
+              </a:graphicData>
+            </a:graphic>
+          </wp:inline>
+        </w:drawing>
       </w:r>
     </w:p>
     <w:p>
@@ -1763,6 +1977,7 @@
         <w:rPr>
           <w:rFonts w:cs="Calibri"/>
         </w:rPr>
+        <w:lastRenderedPageBreak/>
         <w:t>Go to the property's "Readings" page.</w:t>
       </w:r>
     </w:p>
@@ -1810,19 +2025,11 @@
     </w:p>
     <w:p>
       <w:pPr>
-        <w:shd w:val="clear" w:color="auto" w:fill="FFF3CD"/>
-        <w:rPr>
-          <w:rFonts w:cs="Calibri"/>
-        </w:rPr>
-      </w:pPr>
-      <w:r>
-        <w:rPr>
-          <w:rFonts w:cs="Calibri"/>
-          <w:b/>
-          <w:color w:val="856404"/>
-        </w:rPr>
-        <w:t>[Screenshot: Meter reading entry with previous/current readings and charge]</w:t>
-      </w:r>
+        <w:pStyle w:val="ListNumber"/>
+        <w:rPr>
+          <w:rFonts w:cs="Calibri"/>
+        </w:rPr>
+      </w:pPr>
     </w:p>
     <w:p>
       <w:pPr>
@@ -1895,18 +2102,50 @@
     </w:p>
     <w:p>
       <w:pPr>
-        <w:shd w:val="clear" w:color="auto" w:fill="FFF3CD"/>
-        <w:rPr>
-          <w:rFonts w:cs="Calibri"/>
-        </w:rPr>
-      </w:pPr>
-      <w:r>
-        <w:rPr>
-          <w:rFonts w:cs="Calibri"/>
-          <w:b/>
-          <w:color w:val="856404"/>
-        </w:rPr>
-        <w:t>[Screenshot: Add charge dialog with type, period, amount]</w:t>
+        <w:pStyle w:val="ListNumber"/>
+        <w:rPr>
+          <w:rFonts w:cs="Calibri"/>
+        </w:rPr>
+      </w:pPr>
+      <w:r>
+        <w:rPr>
+          <w:rFonts w:cs="Calibri"/>
+        </w:rPr>
+        <w:drawing>
+          <wp:inline distT="0" distB="0" distL="0" distR="0" wp14:anchorId="7CA8E5B3" wp14:editId="3F2043BD">
+            <wp:extent cx="5943600" cy="2709545"/>
+            <wp:effectExtent l="0" t="0" r="0" b="0"/>
+            <wp:docPr id="456262174" name="Picture 1"/>
+            <wp:cNvGraphicFramePr>
+              <a:graphicFrameLocks xmlns:a="http://schemas.openxmlformats.org/drawingml/2006/main" noChangeAspect="1"/>
+            </wp:cNvGraphicFramePr>
+            <a:graphic xmlns:a="http://schemas.openxmlformats.org/drawingml/2006/main">
+              <a:graphicData uri="http://schemas.openxmlformats.org/drawingml/2006/picture">
+                <pic:pic xmlns:pic="http://schemas.openxmlformats.org/drawingml/2006/picture">
+                  <pic:nvPicPr>
+                    <pic:cNvPr id="456262174" name=""/>
+                    <pic:cNvPicPr/>
+                  </pic:nvPicPr>
+                  <pic:blipFill>
+                    <a:blip r:embed="rId19"/>
+                    <a:stretch>
+                      <a:fillRect/>
+                    </a:stretch>
+                  </pic:blipFill>
+                  <pic:spPr>
+                    <a:xfrm>
+                      <a:off x="0" y="0"/>
+                      <a:ext cx="5943600" cy="2709545"/>
+                    </a:xfrm>
+                    <a:prstGeom prst="rect">
+                      <a:avLst/>
+                    </a:prstGeom>
+                  </pic:spPr>
+                </pic:pic>
+              </a:graphicData>
+            </a:graphic>
+          </wp:inline>
+        </w:drawing>
       </w:r>
     </w:p>
     <w:p>
@@ -1994,19 +2233,60 @@
     </w:p>
     <w:p>
       <w:pPr>
-        <w:shd w:val="clear" w:color="auto" w:fill="FFF3CD"/>
-        <w:rPr>
-          <w:rFonts w:cs="Calibri"/>
-        </w:rPr>
-      </w:pPr>
-      <w:r>
-        <w:rPr>
-          <w:rFonts w:cs="Calibri"/>
-          <w:b/>
-          <w:color w:val="856404"/>
-        </w:rPr>
-        <w:t>[Screenshot: Maintenance request list with status and photos]</w:t>
-      </w:r>
+        <w:pStyle w:val="ListNumber"/>
+        <w:rPr>
+          <w:rFonts w:cs="Calibri"/>
+        </w:rPr>
+      </w:pPr>
+      <w:r>
+        <w:rPr>
+          <w:rFonts w:cs="Calibri"/>
+        </w:rPr>
+        <w:lastRenderedPageBreak/>
+        <w:drawing>
+          <wp:inline distT="0" distB="0" distL="0" distR="0" wp14:anchorId="487B1B95" wp14:editId="47A9FF5F">
+            <wp:extent cx="5943600" cy="2597785"/>
+            <wp:effectExtent l="0" t="0" r="0" b="0"/>
+            <wp:docPr id="1205424448" name="Picture 1"/>
+            <wp:cNvGraphicFramePr>
+              <a:graphicFrameLocks xmlns:a="http://schemas.openxmlformats.org/drawingml/2006/main" noChangeAspect="1"/>
+            </wp:cNvGraphicFramePr>
+            <a:graphic xmlns:a="http://schemas.openxmlformats.org/drawingml/2006/main">
+              <a:graphicData uri="http://schemas.openxmlformats.org/drawingml/2006/picture">
+                <pic:pic xmlns:pic="http://schemas.openxmlformats.org/drawingml/2006/picture">
+                  <pic:nvPicPr>
+                    <pic:cNvPr id="1205424448" name=""/>
+                    <pic:cNvPicPr/>
+                  </pic:nvPicPr>
+                  <pic:blipFill>
+                    <a:blip r:embed="rId20"/>
+                    <a:stretch>
+                      <a:fillRect/>
+                    </a:stretch>
+                  </pic:blipFill>
+                  <pic:spPr>
+                    <a:xfrm>
+                      <a:off x="0" y="0"/>
+                      <a:ext cx="5943600" cy="2597785"/>
+                    </a:xfrm>
+                    <a:prstGeom prst="rect">
+                      <a:avLst/>
+                    </a:prstGeom>
+                  </pic:spPr>
+                </pic:pic>
+              </a:graphicData>
+            </a:graphic>
+          </wp:inline>
+        </w:drawing>
+      </w:r>
+    </w:p>
+    <w:p>
+      <w:pPr>
+        <w:pStyle w:val="ListNumber"/>
+        <w:rPr>
+          <w:rFonts w:cs="Calibri"/>
+        </w:rPr>
+      </w:pPr>
     </w:p>
     <w:p>
       <w:pPr>
@@ -2019,8 +2299,397 @@
         <w:rPr>
           <w:rFonts w:cs="Calibri"/>
         </w:rPr>
+        <w:t>8. Contracts</w:t>
+      </w:r>
+    </w:p>
+    <w:p>
+      <w:pPr>
+        <w:pStyle w:val="Heading3"/>
+        <w:rPr>
+          <w:rFonts w:cs="Calibri"/>
+        </w:rPr>
+      </w:pPr>
+      <w:r>
+        <w:rPr>
+          <w:rFonts w:cs="Calibri"/>
+        </w:rPr>
+        <w:t>8.1 Creating a contract</w:t>
+      </w:r>
+    </w:p>
+    <w:p>
+      <w:pPr>
+        <w:pStyle w:val="ListNumber"/>
+        <w:rPr>
+          <w:rFonts w:cs="Calibri"/>
+        </w:rPr>
+      </w:pPr>
+      <w:r>
+        <w:rPr>
+          <w:rFonts w:cs="Calibri"/>
+        </w:rPr>
+        <w:t>Open a lease → click "Generate contract".</w:t>
+      </w:r>
+    </w:p>
+    <w:p>
+      <w:pPr>
+        <w:pStyle w:val="ListNumber"/>
+        <w:rPr>
+          <w:rFonts w:cs="Calibri"/>
+        </w:rPr>
+      </w:pPr>
+      <w:r>
+        <w:rPr>
+          <w:rFonts w:cs="Calibri"/>
+        </w:rPr>
+        <w:t>Select the template (residential, bedspace, or commercial) and language (English, Filipino, or bilingual).</w:t>
+      </w:r>
+    </w:p>
+    <w:p>
+      <w:pPr>
+        <w:pStyle w:val="ListNumber"/>
+        <w:rPr>
+          <w:rFonts w:cs="Calibri"/>
+        </w:rPr>
+      </w:pPr>
+      <w:r>
+        <w:rPr>
+          <w:rFonts w:cs="Calibri"/>
+        </w:rPr>
+        <w:t>Review the terms — rent, deposit, dates, and any custom clauses.</w:t>
+      </w:r>
+    </w:p>
+    <w:p>
+      <w:pPr>
+        <w:pStyle w:val="ListNumber"/>
+        <w:rPr>
+          <w:rFonts w:cs="Calibri"/>
+        </w:rPr>
+      </w:pPr>
+      <w:r>
+        <w:rPr>
+          <w:rFonts w:cs="Calibri"/>
+        </w:rPr>
+        <w:t>Click "Issue contract". The contract is frozen as a snapshot.</w:t>
+      </w:r>
+    </w:p>
+    <w:p>
+      <w:pPr>
+        <w:pStyle w:val="ListNumber"/>
+        <w:rPr>
+          <w:rFonts w:cs="Calibri"/>
+        </w:rPr>
+      </w:pPr>
+      <w:r>
+        <w:rPr>
+          <w:rFonts w:cs="Calibri"/>
+        </w:rPr>
+        <w:drawing>
+          <wp:inline distT="0" distB="0" distL="0" distR="0" wp14:anchorId="139014E8" wp14:editId="307092B4">
+            <wp:extent cx="5943600" cy="2232660"/>
+            <wp:effectExtent l="0" t="0" r="0" b="0"/>
+            <wp:docPr id="1892338508" name="Picture 1"/>
+            <wp:cNvGraphicFramePr>
+              <a:graphicFrameLocks xmlns:a="http://schemas.openxmlformats.org/drawingml/2006/main" noChangeAspect="1"/>
+            </wp:cNvGraphicFramePr>
+            <a:graphic xmlns:a="http://schemas.openxmlformats.org/drawingml/2006/main">
+              <a:graphicData uri="http://schemas.openxmlformats.org/drawingml/2006/picture">
+                <pic:pic xmlns:pic="http://schemas.openxmlformats.org/drawingml/2006/picture">
+                  <pic:nvPicPr>
+                    <pic:cNvPr id="1892338508" name=""/>
+                    <pic:cNvPicPr/>
+                  </pic:nvPicPr>
+                  <pic:blipFill>
+                    <a:blip r:embed="rId21"/>
+                    <a:stretch>
+                      <a:fillRect/>
+                    </a:stretch>
+                  </pic:blipFill>
+                  <pic:spPr>
+                    <a:xfrm>
+                      <a:off x="0" y="0"/>
+                      <a:ext cx="5943600" cy="2232660"/>
+                    </a:xfrm>
+                    <a:prstGeom prst="rect">
+                      <a:avLst/>
+                    </a:prstGeom>
+                  </pic:spPr>
+                </pic:pic>
+              </a:graphicData>
+            </a:graphic>
+          </wp:inline>
+        </w:drawing>
+      </w:r>
+    </w:p>
+    <w:p>
+      <w:pPr>
+        <w:pStyle w:val="ListNumber"/>
+        <w:rPr>
+          <w:rFonts w:cs="Calibri"/>
+        </w:rPr>
+      </w:pPr>
+    </w:p>
+    <w:p>
+      <w:pPr>
+        <w:pStyle w:val="Heading3"/>
+        <w:rPr>
+          <w:rFonts w:cs="Calibri"/>
+        </w:rPr>
+      </w:pPr>
+      <w:r>
+        <w:rPr>
+          <w:rFonts w:cs="Calibri"/>
+        </w:rPr>
+        <w:t>8.2 Sending for signature</w:t>
+      </w:r>
+    </w:p>
+    <w:p>
+      <w:pPr>
+        <w:pStyle w:val="ListNumber"/>
+        <w:rPr>
+          <w:rFonts w:cs="Calibri"/>
+        </w:rPr>
+      </w:pPr>
+      <w:r>
+        <w:rPr>
+          <w:rFonts w:cs="Calibri"/>
+        </w:rPr>
+        <w:t>After issuing, click "Send to tenant".</w:t>
+      </w:r>
+    </w:p>
+    <w:p>
+      <w:pPr>
+        <w:pStyle w:val="ListNumber"/>
+        <w:rPr>
+          <w:rFonts w:cs="Calibri"/>
+        </w:rPr>
+      </w:pPr>
+      <w:r>
+        <w:rPr>
+          <w:rFonts w:cs="Calibri"/>
+        </w:rPr>
         <w:lastRenderedPageBreak/>
-        <w:t>8. Contracts</w:t>
+        <w:t>An email with a signing link is sent to the tenant.</w:t>
+      </w:r>
+    </w:p>
+    <w:p>
+      <w:pPr>
+        <w:pStyle w:val="ListNumber"/>
+        <w:rPr>
+          <w:rFonts w:cs="Calibri"/>
+        </w:rPr>
+      </w:pPr>
+      <w:r>
+        <w:rPr>
+          <w:rFonts w:cs="Calibri"/>
+        </w:rPr>
+        <w:t>The tenant signs without needing an account.</w:t>
+      </w:r>
+    </w:p>
+    <w:p>
+      <w:pPr>
+        <w:pStyle w:val="ListNumber"/>
+        <w:rPr>
+          <w:rFonts w:cs="Calibri"/>
+        </w:rPr>
+      </w:pPr>
+      <w:r>
+        <w:rPr>
+          <w:rFonts w:cs="Calibri"/>
+        </w:rPr>
+        <w:t>You countersign from your dashboard.</w:t>
+      </w:r>
+    </w:p>
+    <w:p>
+      <w:pPr>
+        <w:pStyle w:val="ListNumber"/>
+        <w:rPr>
+          <w:rFonts w:cs="Calibri"/>
+        </w:rPr>
+      </w:pPr>
+      <w:r>
+        <w:rPr>
+          <w:rFonts w:cs="Calibri"/>
+        </w:rPr>
+        <w:drawing>
+          <wp:inline distT="0" distB="0" distL="0" distR="0" wp14:anchorId="32D1F7B5" wp14:editId="240650BB">
+            <wp:extent cx="5943600" cy="2710180"/>
+            <wp:effectExtent l="0" t="0" r="0" b="0"/>
+            <wp:docPr id="1533084316" name="Picture 1"/>
+            <wp:cNvGraphicFramePr>
+              <a:graphicFrameLocks xmlns:a="http://schemas.openxmlformats.org/drawingml/2006/main" noChangeAspect="1"/>
+            </wp:cNvGraphicFramePr>
+            <a:graphic xmlns:a="http://schemas.openxmlformats.org/drawingml/2006/main">
+              <a:graphicData uri="http://schemas.openxmlformats.org/drawingml/2006/picture">
+                <pic:pic xmlns:pic="http://schemas.openxmlformats.org/drawingml/2006/picture">
+                  <pic:nvPicPr>
+                    <pic:cNvPr id="1533084316" name=""/>
+                    <pic:cNvPicPr/>
+                  </pic:nvPicPr>
+                  <pic:blipFill>
+                    <a:blip r:embed="rId22"/>
+                    <a:stretch>
+                      <a:fillRect/>
+                    </a:stretch>
+                  </pic:blipFill>
+                  <pic:spPr>
+                    <a:xfrm>
+                      <a:off x="0" y="0"/>
+                      <a:ext cx="5943600" cy="2710180"/>
+                    </a:xfrm>
+                    <a:prstGeom prst="rect">
+                      <a:avLst/>
+                    </a:prstGeom>
+                  </pic:spPr>
+                </pic:pic>
+              </a:graphicData>
+            </a:graphic>
+          </wp:inline>
+        </w:drawing>
+      </w:r>
+    </w:p>
+    <w:p>
+      <w:pPr>
+        <w:pStyle w:val="ListNumber"/>
+        <w:rPr>
+          <w:rFonts w:cs="Calibri"/>
+        </w:rPr>
+      </w:pPr>
+      <w:r>
+        <w:rPr>
+          <w:rFonts w:cs="Calibri"/>
+        </w:rPr>
+        <w:drawing>
+          <wp:inline distT="0" distB="0" distL="0" distR="0" wp14:anchorId="7A70FC07" wp14:editId="24ED1417">
+            <wp:extent cx="5943600" cy="2834640"/>
+            <wp:effectExtent l="0" t="0" r="0" b="0"/>
+            <wp:docPr id="26831066" name="Picture 1"/>
+            <wp:cNvGraphicFramePr>
+              <a:graphicFrameLocks xmlns:a="http://schemas.openxmlformats.org/drawingml/2006/main" noChangeAspect="1"/>
+            </wp:cNvGraphicFramePr>
+            <a:graphic xmlns:a="http://schemas.openxmlformats.org/drawingml/2006/main">
+              <a:graphicData uri="http://schemas.openxmlformats.org/drawingml/2006/picture">
+                <pic:pic xmlns:pic="http://schemas.openxmlformats.org/drawingml/2006/picture">
+                  <pic:nvPicPr>
+                    <pic:cNvPr id="26831066" name=""/>
+                    <pic:cNvPicPr/>
+                  </pic:nvPicPr>
+                  <pic:blipFill>
+                    <a:blip r:embed="rId23"/>
+                    <a:stretch>
+                      <a:fillRect/>
+                    </a:stretch>
+                  </pic:blipFill>
+                  <pic:spPr>
+                    <a:xfrm>
+                      <a:off x="0" y="0"/>
+                      <a:ext cx="5943600" cy="2834640"/>
+                    </a:xfrm>
+                    <a:prstGeom prst="rect">
+                      <a:avLst/>
+                    </a:prstGeom>
+                  </pic:spPr>
+                </pic:pic>
+              </a:graphicData>
+            </a:graphic>
+          </wp:inline>
+        </w:drawing>
+      </w:r>
+    </w:p>
+    <w:p>
+      <w:pPr>
+        <w:pStyle w:val="ListNumber"/>
+        <w:rPr>
+          <w:rFonts w:cs="Calibri"/>
+        </w:rPr>
+      </w:pPr>
+      <w:r>
+        <w:rPr>
+          <w:rFonts w:cs="Calibri"/>
+        </w:rPr>
+        <w:lastRenderedPageBreak/>
+        <w:drawing>
+          <wp:inline distT="0" distB="0" distL="0" distR="0" wp14:anchorId="0F47A5A5" wp14:editId="5231098C">
+            <wp:extent cx="5943600" cy="2856230"/>
+            <wp:effectExtent l="0" t="0" r="0" b="0"/>
+            <wp:docPr id="2136877607" name="Picture 1"/>
+            <wp:cNvGraphicFramePr>
+              <a:graphicFrameLocks xmlns:a="http://schemas.openxmlformats.org/drawingml/2006/main" noChangeAspect="1"/>
+            </wp:cNvGraphicFramePr>
+            <a:graphic xmlns:a="http://schemas.openxmlformats.org/drawingml/2006/main">
+              <a:graphicData uri="http://schemas.openxmlformats.org/drawingml/2006/picture">
+                <pic:pic xmlns:pic="http://schemas.openxmlformats.org/drawingml/2006/picture">
+                  <pic:nvPicPr>
+                    <pic:cNvPr id="2136877607" name=""/>
+                    <pic:cNvPicPr/>
+                  </pic:nvPicPr>
+                  <pic:blipFill>
+                    <a:blip r:embed="rId24"/>
+                    <a:stretch>
+                      <a:fillRect/>
+                    </a:stretch>
+                  </pic:blipFill>
+                  <pic:spPr>
+                    <a:xfrm>
+                      <a:off x="0" y="0"/>
+                      <a:ext cx="5943600" cy="2856230"/>
+                    </a:xfrm>
+                    <a:prstGeom prst="rect">
+                      <a:avLst/>
+                    </a:prstGeom>
+                  </pic:spPr>
+                </pic:pic>
+              </a:graphicData>
+            </a:graphic>
+          </wp:inline>
+        </w:drawing>
+      </w:r>
+    </w:p>
+    <w:p>
+      <w:pPr>
+        <w:pStyle w:val="ListNumber"/>
+        <w:rPr>
+          <w:rFonts w:cs="Calibri"/>
+        </w:rPr>
+      </w:pPr>
+      <w:r>
+        <w:rPr>
+          <w:rFonts w:cs="Calibri"/>
+        </w:rPr>
+        <w:drawing>
+          <wp:inline distT="0" distB="0" distL="0" distR="0" wp14:anchorId="58F55C47" wp14:editId="6FD81B07">
+            <wp:extent cx="5943600" cy="3342640"/>
+            <wp:effectExtent l="0" t="0" r="0" b="0"/>
+            <wp:docPr id="1028371421" name="Picture 1"/>
+            <wp:cNvGraphicFramePr>
+              <a:graphicFrameLocks xmlns:a="http://schemas.openxmlformats.org/drawingml/2006/main" noChangeAspect="1"/>
+            </wp:cNvGraphicFramePr>
+            <a:graphic xmlns:a="http://schemas.openxmlformats.org/drawingml/2006/main">
+              <a:graphicData uri="http://schemas.openxmlformats.org/drawingml/2006/picture">
+                <pic:pic xmlns:pic="http://schemas.openxmlformats.org/drawingml/2006/picture">
+                  <pic:nvPicPr>
+                    <pic:cNvPr id="1028371421" name=""/>
+                    <pic:cNvPicPr/>
+                  </pic:nvPicPr>
+                  <pic:blipFill>
+                    <a:blip r:embed="rId25"/>
+                    <a:stretch>
+                      <a:fillRect/>
+                    </a:stretch>
+                  </pic:blipFill>
+                  <pic:spPr>
+                    <a:xfrm>
+                      <a:off x="0" y="0"/>
+                      <a:ext cx="5943600" cy="3342640"/>
+                    </a:xfrm>
+                    <a:prstGeom prst="rect">
+                      <a:avLst/>
+                    </a:prstGeom>
+                  </pic:spPr>
+                </pic:pic>
+              </a:graphicData>
+            </a:graphic>
+          </wp:inline>
+        </w:drawing>
       </w:r>
     </w:p>
     <w:p>
@@ -2034,79 +2703,188 @@
         <w:rPr>
           <w:rFonts w:cs="Calibri"/>
         </w:rPr>
-        <w:t>8.1 Creating a contract</w:t>
-      </w:r>
-    </w:p>
-    <w:p>
-      <w:pPr>
-        <w:pStyle w:val="ListNumber"/>
-        <w:rPr>
-          <w:rFonts w:cs="Calibri"/>
-        </w:rPr>
-      </w:pPr>
-      <w:r>
-        <w:rPr>
-          <w:rFonts w:cs="Calibri"/>
-        </w:rPr>
-        <w:t>Open a lease → click "Generate contract".</w:t>
-      </w:r>
-    </w:p>
-    <w:p>
-      <w:pPr>
-        <w:pStyle w:val="ListNumber"/>
-        <w:rPr>
-          <w:rFonts w:cs="Calibri"/>
-        </w:rPr>
-      </w:pPr>
-      <w:r>
-        <w:rPr>
-          <w:rFonts w:cs="Calibri"/>
-        </w:rPr>
-        <w:t>Select the template (residential, bedspace, or commercial) and language (English, Filipino, or bilingual).</w:t>
-      </w:r>
-    </w:p>
-    <w:p>
-      <w:pPr>
-        <w:pStyle w:val="ListNumber"/>
-        <w:rPr>
-          <w:rFonts w:cs="Calibri"/>
-        </w:rPr>
-      </w:pPr>
-      <w:r>
-        <w:rPr>
-          <w:rFonts w:cs="Calibri"/>
-        </w:rPr>
-        <w:t>Review the terms — rent, deposit, dates, and any custom clauses.</w:t>
-      </w:r>
-    </w:p>
-    <w:p>
-      <w:pPr>
-        <w:pStyle w:val="ListNumber"/>
-        <w:rPr>
-          <w:rFonts w:cs="Calibri"/>
-        </w:rPr>
-      </w:pPr>
-      <w:r>
-        <w:rPr>
-          <w:rFonts w:cs="Calibri"/>
-        </w:rPr>
-        <w:t>Click "Issue contract". The contract is frozen as a snapshot.</w:t>
-      </w:r>
-    </w:p>
-    <w:p>
-      <w:pPr>
-        <w:shd w:val="clear" w:color="auto" w:fill="FFF3CD"/>
-        <w:rPr>
-          <w:rFonts w:cs="Calibri"/>
-        </w:rPr>
-      </w:pPr>
-      <w:r>
-        <w:rPr>
-          <w:rFonts w:cs="Calibri"/>
-          <w:b/>
-          <w:color w:val="856404"/>
-        </w:rPr>
-        <w:t>[Screenshot: Contract generation with template and language selection]</w:t>
+        <w:t>8.3 Reminders</w:t>
+      </w:r>
+    </w:p>
+    <w:p>
+      <w:pPr>
+        <w:rPr>
+          <w:rFonts w:cs="Calibri"/>
+        </w:rPr>
+      </w:pPr>
+      <w:r>
+        <w:rPr>
+          <w:rFonts w:cs="Calibri"/>
+        </w:rPr>
+        <w:t>If the tenant doesn't open the contract, reminders are sent automatically at 3 and 7 days.</w:t>
+      </w:r>
+    </w:p>
+    <w:p>
+      <w:pPr>
+        <w:pStyle w:val="Heading2"/>
+        <w:rPr>
+          <w:rFonts w:cs="Calibri"/>
+        </w:rPr>
+      </w:pPr>
+      <w:r>
+        <w:rPr>
+          <w:rFonts w:cs="Calibri"/>
+        </w:rPr>
+        <w:t>9. Tenant portal</w:t>
+      </w:r>
+    </w:p>
+    <w:p>
+      <w:pPr>
+        <w:rPr>
+          <w:rFonts w:cs="Calibri"/>
+        </w:rPr>
+      </w:pPr>
+      <w:r>
+        <w:rPr>
+          <w:rFonts w:cs="Calibri"/>
+        </w:rPr>
+        <w:t>The tenant portal is a separate login for tenants. They can:</w:t>
+      </w:r>
+    </w:p>
+    <w:p>
+      <w:pPr>
+        <w:pStyle w:val="ListBullet"/>
+        <w:rPr>
+          <w:rFonts w:ascii="Calibri" w:cs="Calibri"/>
+        </w:rPr>
+      </w:pPr>
+      <w:r>
+        <w:rPr>
+          <w:rFonts w:ascii="Calibri" w:cs="Calibri"/>
+        </w:rPr>
+        <w:t>View their statement of account.</w:t>
+      </w:r>
+    </w:p>
+    <w:p>
+      <w:pPr>
+        <w:pStyle w:val="ListBullet"/>
+        <w:rPr>
+          <w:rFonts w:ascii="Calibri" w:cs="Calibri"/>
+        </w:rPr>
+      </w:pPr>
+      <w:r>
+        <w:rPr>
+          <w:rFonts w:ascii="Calibri" w:cs="Calibri"/>
+        </w:rPr>
+        <w:t>See how much is due and payment instructions (GCash/bank).</w:t>
+      </w:r>
+    </w:p>
+    <w:p>
+      <w:pPr>
+        <w:pStyle w:val="ListBullet"/>
+        <w:rPr>
+          <w:rFonts w:ascii="Calibri" w:cs="Calibri"/>
+        </w:rPr>
+      </w:pPr>
+      <w:r>
+        <w:rPr>
+          <w:rFonts w:ascii="Calibri" w:cs="Calibri"/>
+        </w:rPr>
+        <w:lastRenderedPageBreak/>
+        <w:t>Submit a payment reference number after paying.</w:t>
+      </w:r>
+    </w:p>
+    <w:p>
+      <w:pPr>
+        <w:pStyle w:val="ListBullet"/>
+        <w:rPr>
+          <w:rFonts w:ascii="Calibri" w:cs="Calibri"/>
+        </w:rPr>
+      </w:pPr>
+      <w:r>
+        <w:rPr>
+          <w:rFonts w:ascii="Calibri" w:cs="Calibri"/>
+        </w:rPr>
+        <w:t>View and sign their lease contract.</w:t>
+      </w:r>
+    </w:p>
+    <w:p>
+      <w:pPr>
+        <w:pStyle w:val="ListBullet"/>
+        <w:rPr>
+          <w:rFonts w:ascii="Calibri" w:cs="Calibri"/>
+        </w:rPr>
+      </w:pPr>
+      <w:r>
+        <w:rPr>
+          <w:rFonts w:ascii="Calibri" w:cs="Calibri"/>
+        </w:rPr>
+        <w:t>Submit maintenance requests with photos.</w:t>
+      </w:r>
+    </w:p>
+    <w:p>
+      <w:pPr>
+        <w:pStyle w:val="ListBullet"/>
+        <w:rPr>
+          <w:rFonts w:ascii="Calibri" w:cs="Calibri"/>
+        </w:rPr>
+      </w:pPr>
+      <w:r>
+        <w:rPr>
+          <w:rFonts w:ascii="Calibri" w:cs="Calibri"/>
+        </w:rPr>
+        <w:drawing>
+          <wp:inline distT="0" distB="0" distL="0" distR="0" wp14:anchorId="745A8A4D" wp14:editId="52AA6D3C">
+            <wp:extent cx="5943600" cy="2870200"/>
+            <wp:effectExtent l="0" t="0" r="0" b="0"/>
+            <wp:docPr id="1596591336" name="Picture 1"/>
+            <wp:cNvGraphicFramePr>
+              <a:graphicFrameLocks xmlns:a="http://schemas.openxmlformats.org/drawingml/2006/main" noChangeAspect="1"/>
+            </wp:cNvGraphicFramePr>
+            <a:graphic xmlns:a="http://schemas.openxmlformats.org/drawingml/2006/main">
+              <a:graphicData uri="http://schemas.openxmlformats.org/drawingml/2006/picture">
+                <pic:pic xmlns:pic="http://schemas.openxmlformats.org/drawingml/2006/picture">
+                  <pic:nvPicPr>
+                    <pic:cNvPr id="1596591336" name=""/>
+                    <pic:cNvPicPr/>
+                  </pic:nvPicPr>
+                  <pic:blipFill>
+                    <a:blip r:embed="rId26"/>
+                    <a:stretch>
+                      <a:fillRect/>
+                    </a:stretch>
+                  </pic:blipFill>
+                  <pic:spPr>
+                    <a:xfrm>
+                      <a:off x="0" y="0"/>
+                      <a:ext cx="5943600" cy="2870200"/>
+                    </a:xfrm>
+                    <a:prstGeom prst="rect">
+                      <a:avLst/>
+                    </a:prstGeom>
+                  </pic:spPr>
+                </pic:pic>
+              </a:graphicData>
+            </a:graphic>
+          </wp:inline>
+        </w:drawing>
+      </w:r>
+    </w:p>
+    <w:p>
+      <w:pPr>
+        <w:pStyle w:val="ListBullet"/>
+        <w:rPr>
+          <w:rFonts w:ascii="Calibri" w:cs="Calibri"/>
+        </w:rPr>
+      </w:pPr>
+    </w:p>
+    <w:p>
+      <w:pPr>
+        <w:pStyle w:val="Heading2"/>
+        <w:rPr>
+          <w:rFonts w:cs="Calibri"/>
+        </w:rPr>
+      </w:pPr>
+      <w:r>
+        <w:rPr>
+          <w:rFonts w:cs="Calibri"/>
+        </w:rPr>
+        <w:t>10. Reports and finance</w:t>
       </w:r>
     </w:p>
     <w:p>
@@ -2120,79 +2898,162 @@
         <w:rPr>
           <w:rFonts w:cs="Calibri"/>
         </w:rPr>
-        <w:t>8.2 Sending for signature</w:t>
-      </w:r>
-    </w:p>
-    <w:p>
-      <w:pPr>
-        <w:pStyle w:val="ListNumber"/>
-        <w:rPr>
-          <w:rFonts w:cs="Calibri"/>
-        </w:rPr>
-      </w:pPr>
-      <w:r>
-        <w:rPr>
-          <w:rFonts w:cs="Calibri"/>
-        </w:rPr>
-        <w:t>After issuing, click "Send to tenant".</w:t>
-      </w:r>
-    </w:p>
-    <w:p>
-      <w:pPr>
-        <w:pStyle w:val="ListNumber"/>
-        <w:rPr>
-          <w:rFonts w:cs="Calibri"/>
-        </w:rPr>
-      </w:pPr>
-      <w:r>
-        <w:rPr>
-          <w:rFonts w:cs="Calibri"/>
-        </w:rPr>
-        <w:t>An email with a signing link is sent to the tenant.</w:t>
-      </w:r>
-    </w:p>
-    <w:p>
-      <w:pPr>
-        <w:pStyle w:val="ListNumber"/>
-        <w:rPr>
-          <w:rFonts w:cs="Calibri"/>
-        </w:rPr>
-      </w:pPr>
-      <w:r>
-        <w:rPr>
-          <w:rFonts w:cs="Calibri"/>
-        </w:rPr>
-        <w:t>The tenant signs without needing an account.</w:t>
-      </w:r>
-    </w:p>
-    <w:p>
-      <w:pPr>
-        <w:pStyle w:val="ListNumber"/>
-        <w:rPr>
-          <w:rFonts w:cs="Calibri"/>
-        </w:rPr>
-      </w:pPr>
-      <w:r>
-        <w:rPr>
-          <w:rFonts w:cs="Calibri"/>
-        </w:rPr>
-        <w:t>You countersign from your dashboard.</w:t>
-      </w:r>
-    </w:p>
-    <w:p>
-      <w:pPr>
-        <w:shd w:val="clear" w:color="auto" w:fill="FFF3CD"/>
-        <w:rPr>
-          <w:rFonts w:cs="Calibri"/>
-        </w:rPr>
-      </w:pPr>
-      <w:r>
-        <w:rPr>
-          <w:rFonts w:cs="Calibri"/>
-          <w:b/>
-          <w:color w:val="856404"/>
-        </w:rPr>
-        <w:t>[Screenshot: Contract page with Send to tenant button and signing status]</w:t>
+        <w:t>10.1 Finance page</w:t>
+      </w:r>
+    </w:p>
+    <w:p>
+      <w:pPr>
+        <w:rPr>
+          <w:rFonts w:cs="Calibri"/>
+        </w:rPr>
+      </w:pPr>
+      <w:r>
+        <w:rPr>
+          <w:rFonts w:cs="Calibri"/>
+        </w:rPr>
+        <w:t>The Finance page shows all payments and expenses, with filters by property. You can record payments, verify pending submissions, and manage expenses.</w:t>
+      </w:r>
+    </w:p>
+    <w:p>
+      <w:pPr>
+        <w:rPr>
+          <w:rFonts w:cs="Calibri"/>
+        </w:rPr>
+      </w:pPr>
+      <w:r>
+        <w:rPr>
+          <w:rFonts w:cs="Calibri"/>
+        </w:rPr>
+        <w:drawing>
+          <wp:inline distT="0" distB="0" distL="0" distR="0" wp14:anchorId="4D7CA697" wp14:editId="2411800D">
+            <wp:extent cx="5943600" cy="2563495"/>
+            <wp:effectExtent l="0" t="0" r="0" b="0"/>
+            <wp:docPr id="910528945" name="Picture 1"/>
+            <wp:cNvGraphicFramePr>
+              <a:graphicFrameLocks xmlns:a="http://schemas.openxmlformats.org/drawingml/2006/main" noChangeAspect="1"/>
+            </wp:cNvGraphicFramePr>
+            <a:graphic xmlns:a="http://schemas.openxmlformats.org/drawingml/2006/main">
+              <a:graphicData uri="http://schemas.openxmlformats.org/drawingml/2006/picture">
+                <pic:pic xmlns:pic="http://schemas.openxmlformats.org/drawingml/2006/picture">
+                  <pic:nvPicPr>
+                    <pic:cNvPr id="910528945" name=""/>
+                    <pic:cNvPicPr/>
+                  </pic:nvPicPr>
+                  <pic:blipFill>
+                    <a:blip r:embed="rId27"/>
+                    <a:stretch>
+                      <a:fillRect/>
+                    </a:stretch>
+                  </pic:blipFill>
+                  <pic:spPr>
+                    <a:xfrm>
+                      <a:off x="0" y="0"/>
+                      <a:ext cx="5943600" cy="2563495"/>
+                    </a:xfrm>
+                    <a:prstGeom prst="rect">
+                      <a:avLst/>
+                    </a:prstGeom>
+                  </pic:spPr>
+                </pic:pic>
+              </a:graphicData>
+            </a:graphic>
+          </wp:inline>
+        </w:drawing>
+      </w:r>
+    </w:p>
+    <w:p>
+      <w:pPr>
+        <w:rPr>
+          <w:rFonts w:cs="Calibri"/>
+        </w:rPr>
+      </w:pPr>
+      <w:r>
+        <w:rPr>
+          <w:rFonts w:cs="Calibri"/>
+        </w:rPr>
+        <w:lastRenderedPageBreak/>
+        <w:drawing>
+          <wp:inline distT="0" distB="0" distL="0" distR="0" wp14:anchorId="252DED92" wp14:editId="3A921D5F">
+            <wp:extent cx="5943600" cy="2191385"/>
+            <wp:effectExtent l="0" t="0" r="0" b="0"/>
+            <wp:docPr id="1196588264" name="Picture 1"/>
+            <wp:cNvGraphicFramePr>
+              <a:graphicFrameLocks xmlns:a="http://schemas.openxmlformats.org/drawingml/2006/main" noChangeAspect="1"/>
+            </wp:cNvGraphicFramePr>
+            <a:graphic xmlns:a="http://schemas.openxmlformats.org/drawingml/2006/main">
+              <a:graphicData uri="http://schemas.openxmlformats.org/drawingml/2006/picture">
+                <pic:pic xmlns:pic="http://schemas.openxmlformats.org/drawingml/2006/picture">
+                  <pic:nvPicPr>
+                    <pic:cNvPr id="1196588264" name=""/>
+                    <pic:cNvPicPr/>
+                  </pic:nvPicPr>
+                  <pic:blipFill>
+                    <a:blip r:embed="rId28"/>
+                    <a:stretch>
+                      <a:fillRect/>
+                    </a:stretch>
+                  </pic:blipFill>
+                  <pic:spPr>
+                    <a:xfrm>
+                      <a:off x="0" y="0"/>
+                      <a:ext cx="5943600" cy="2191385"/>
+                    </a:xfrm>
+                    <a:prstGeom prst="rect">
+                      <a:avLst/>
+                    </a:prstGeom>
+                  </pic:spPr>
+                </pic:pic>
+              </a:graphicData>
+            </a:graphic>
+          </wp:inline>
+        </w:drawing>
+      </w:r>
+    </w:p>
+    <w:p>
+      <w:pPr>
+        <w:rPr>
+          <w:rFonts w:cs="Calibri"/>
+        </w:rPr>
+      </w:pPr>
+      <w:r>
+        <w:rPr>
+          <w:rFonts w:cs="Calibri"/>
+        </w:rPr>
+        <w:drawing>
+          <wp:inline distT="0" distB="0" distL="0" distR="0" wp14:anchorId="5D4DD639" wp14:editId="64B91D3A">
+            <wp:extent cx="5943600" cy="1096645"/>
+            <wp:effectExtent l="0" t="0" r="0" b="0"/>
+            <wp:docPr id="13188291" name="Picture 1"/>
+            <wp:cNvGraphicFramePr>
+              <a:graphicFrameLocks xmlns:a="http://schemas.openxmlformats.org/drawingml/2006/main" noChangeAspect="1"/>
+            </wp:cNvGraphicFramePr>
+            <a:graphic xmlns:a="http://schemas.openxmlformats.org/drawingml/2006/main">
+              <a:graphicData uri="http://schemas.openxmlformats.org/drawingml/2006/picture">
+                <pic:pic xmlns:pic="http://schemas.openxmlformats.org/drawingml/2006/picture">
+                  <pic:nvPicPr>
+                    <pic:cNvPr id="13188291" name=""/>
+                    <pic:cNvPicPr/>
+                  </pic:nvPicPr>
+                  <pic:blipFill>
+                    <a:blip r:embed="rId29"/>
+                    <a:stretch>
+                      <a:fillRect/>
+                    </a:stretch>
+                  </pic:blipFill>
+                  <pic:spPr>
+                    <a:xfrm>
+                      <a:off x="0" y="0"/>
+                      <a:ext cx="5943600" cy="1096645"/>
+                    </a:xfrm>
+                    <a:prstGeom prst="rect">
+                      <a:avLst/>
+                    </a:prstGeom>
+                  </pic:spPr>
+                </pic:pic>
+              </a:graphicData>
+            </a:graphic>
+          </wp:inline>
+        </w:drawing>
       </w:r>
     </w:p>
     <w:p>
@@ -2206,20 +3067,161 @@
         <w:rPr>
           <w:rFonts w:cs="Calibri"/>
         </w:rPr>
-        <w:t>8.3 Reminders</w:t>
-      </w:r>
-    </w:p>
-    <w:p>
-      <w:pPr>
-        <w:rPr>
-          <w:rFonts w:cs="Calibri"/>
-        </w:rPr>
-      </w:pPr>
-      <w:r>
-        <w:rPr>
-          <w:rFonts w:cs="Calibri"/>
-        </w:rPr>
-        <w:t>If the tenant doesn't open the contract, reminders are sent automatically at 3 and 7 days.</w:t>
+        <w:t>10.2 Reports</w:t>
+      </w:r>
+    </w:p>
+    <w:p>
+      <w:pPr>
+        <w:rPr>
+          <w:rFonts w:cs="Calibri"/>
+        </w:rPr>
+      </w:pPr>
+      <w:r>
+        <w:rPr>
+          <w:rFonts w:cs="Calibri"/>
+        </w:rPr>
+        <w:t>Three reports are available, exportable as CSV:</w:t>
+      </w:r>
+    </w:p>
+    <w:p>
+      <w:pPr>
+        <w:pStyle w:val="ListBullet"/>
+        <w:rPr>
+          <w:rFonts w:ascii="Calibri" w:cs="Calibri"/>
+        </w:rPr>
+      </w:pPr>
+      <w:r>
+        <w:rPr>
+          <w:rFonts w:ascii="Calibri" w:cs="Calibri"/>
+        </w:rPr>
+        <w:t>Cash flow — income vs. expenses per month.</w:t>
+      </w:r>
+    </w:p>
+    <w:p>
+      <w:pPr>
+        <w:pStyle w:val="ListBullet"/>
+        <w:rPr>
+          <w:rFonts w:ascii="Calibri" w:cs="Calibri"/>
+        </w:rPr>
+      </w:pPr>
+      <w:r>
+        <w:rPr>
+          <w:rFonts w:ascii="Calibri" w:cs="Calibri"/>
+        </w:rPr>
+        <w:t>Profit &amp; loss — per property.</w:t>
+      </w:r>
+    </w:p>
+    <w:p>
+      <w:pPr>
+        <w:pStyle w:val="ListBullet"/>
+        <w:rPr>
+          <w:rFonts w:ascii="Calibri" w:cs="Calibri"/>
+        </w:rPr>
+      </w:pPr>
+      <w:r>
+        <w:rPr>
+          <w:rFonts w:ascii="Calibri" w:cs="Calibri"/>
+        </w:rPr>
+        <w:t>Occupancy — occupied units vs. total per month.</w:t>
+      </w:r>
+    </w:p>
+    <w:p>
+      <w:pPr>
+        <w:pStyle w:val="ListBullet"/>
+        <w:ind w:left="0" w:firstLine="0"/>
+        <w:rPr>
+          <w:rFonts w:ascii="Calibri" w:cs="Calibri"/>
+        </w:rPr>
+      </w:pPr>
+      <w:r>
+        <w:rPr>
+          <w:rFonts w:ascii="Calibri" w:cs="Calibri"/>
+        </w:rPr>
+        <w:drawing>
+          <wp:inline distT="0" distB="0" distL="0" distR="0" wp14:anchorId="6560FEBC" wp14:editId="63E5D8B0">
+            <wp:extent cx="5943600" cy="2874645"/>
+            <wp:effectExtent l="0" t="0" r="0" b="0"/>
+            <wp:docPr id="1502009062" name="Picture 1"/>
+            <wp:cNvGraphicFramePr>
+              <a:graphicFrameLocks xmlns:a="http://schemas.openxmlformats.org/drawingml/2006/main" noChangeAspect="1"/>
+            </wp:cNvGraphicFramePr>
+            <a:graphic xmlns:a="http://schemas.openxmlformats.org/drawingml/2006/main">
+              <a:graphicData uri="http://schemas.openxmlformats.org/drawingml/2006/picture">
+                <pic:pic xmlns:pic="http://schemas.openxmlformats.org/drawingml/2006/picture">
+                  <pic:nvPicPr>
+                    <pic:cNvPr id="1502009062" name=""/>
+                    <pic:cNvPicPr/>
+                  </pic:nvPicPr>
+                  <pic:blipFill>
+                    <a:blip r:embed="rId30"/>
+                    <a:stretch>
+                      <a:fillRect/>
+                    </a:stretch>
+                  </pic:blipFill>
+                  <pic:spPr>
+                    <a:xfrm>
+                      <a:off x="0" y="0"/>
+                      <a:ext cx="5943600" cy="2874645"/>
+                    </a:xfrm>
+                    <a:prstGeom prst="rect">
+                      <a:avLst/>
+                    </a:prstGeom>
+                  </pic:spPr>
+                </pic:pic>
+              </a:graphicData>
+            </a:graphic>
+          </wp:inline>
+        </w:drawing>
+      </w:r>
+    </w:p>
+    <w:p>
+      <w:pPr>
+        <w:pStyle w:val="ListBullet"/>
+        <w:ind w:left="0" w:firstLine="0"/>
+        <w:rPr>
+          <w:rFonts w:ascii="Calibri" w:cs="Calibri"/>
+        </w:rPr>
+      </w:pPr>
+      <w:r>
+        <w:rPr>
+          <w:rFonts w:ascii="Calibri" w:cs="Calibri"/>
+        </w:rPr>
+        <w:lastRenderedPageBreak/>
+        <w:drawing>
+          <wp:inline distT="0" distB="0" distL="0" distR="0" wp14:anchorId="378D8B96" wp14:editId="5D409BAC">
+            <wp:extent cx="5943600" cy="2840355"/>
+            <wp:effectExtent l="0" t="0" r="0" b="0"/>
+            <wp:docPr id="362985703" name="Picture 1"/>
+            <wp:cNvGraphicFramePr>
+              <a:graphicFrameLocks xmlns:a="http://schemas.openxmlformats.org/drawingml/2006/main" noChangeAspect="1"/>
+            </wp:cNvGraphicFramePr>
+            <a:graphic xmlns:a="http://schemas.openxmlformats.org/drawingml/2006/main">
+              <a:graphicData uri="http://schemas.openxmlformats.org/drawingml/2006/picture">
+                <pic:pic xmlns:pic="http://schemas.openxmlformats.org/drawingml/2006/picture">
+                  <pic:nvPicPr>
+                    <pic:cNvPr id="362985703" name=""/>
+                    <pic:cNvPicPr/>
+                  </pic:nvPicPr>
+                  <pic:blipFill>
+                    <a:blip r:embed="rId31"/>
+                    <a:stretch>
+                      <a:fillRect/>
+                    </a:stretch>
+                  </pic:blipFill>
+                  <pic:spPr>
+                    <a:xfrm>
+                      <a:off x="0" y="0"/>
+                      <a:ext cx="5943600" cy="2840355"/>
+                    </a:xfrm>
+                    <a:prstGeom prst="rect">
+                      <a:avLst/>
+                    </a:prstGeom>
+                  </pic:spPr>
+                </pic:pic>
+              </a:graphicData>
+            </a:graphic>
+          </wp:inline>
+        </w:drawing>
       </w:r>
     </w:p>
     <w:p>
@@ -2233,20 +3235,20 @@
         <w:rPr>
           <w:rFonts w:cs="Calibri"/>
         </w:rPr>
-        <w:t>9. Tenant portal</w:t>
-      </w:r>
-    </w:p>
-    <w:p>
-      <w:pPr>
-        <w:rPr>
-          <w:rFonts w:cs="Calibri"/>
-        </w:rPr>
-      </w:pPr>
-      <w:r>
-        <w:rPr>
-          <w:rFonts w:cs="Calibri"/>
-        </w:rPr>
-        <w:t>The tenant portal is a separate login for tenants. They can:</w:t>
+        <w:t>11. Referrals</w:t>
+      </w:r>
+    </w:p>
+    <w:p>
+      <w:pPr>
+        <w:rPr>
+          <w:rFonts w:cs="Calibri"/>
+        </w:rPr>
+      </w:pPr>
+      <w:r>
+        <w:rPr>
+          <w:rFonts w:cs="Calibri"/>
+        </w:rPr>
+        <w:t>Every landlord gets a referral link. When someone signs up using your link and becomes a paying customer, you earn a bounty.</w:t>
       </w:r>
     </w:p>
     <w:p>
@@ -2260,7 +3262,7 @@
         <w:rPr>
           <w:rFonts w:ascii="Calibri" w:cs="Calibri"/>
         </w:rPr>
-        <w:t>View their statement of account.</w:t>
+        <w:t>Share your link from the "Referrals" page.</w:t>
       </w:r>
     </w:p>
     <w:p>
@@ -2274,7 +3276,7 @@
         <w:rPr>
           <w:rFonts w:ascii="Calibri" w:cs="Calibri"/>
         </w:rPr>
-        <w:t>See how much is due and payment instructions (GCash/bank).</w:t>
+        <w:t>Track signups and earnings.</w:t>
       </w:r>
     </w:p>
     <w:p>
@@ -2288,7 +3290,7 @@
         <w:rPr>
           <w:rFonts w:ascii="Calibri" w:cs="Calibri"/>
         </w:rPr>
-        <w:t>Submit a payment reference number after paying.</w:t>
+        <w:t>Bounties are paid via GCash or bank transfer after a 30-day waiting period.</w:t>
       </w:r>
     </w:p>
     <w:p>
@@ -2302,7 +3304,41 @@
         <w:rPr>
           <w:rFonts w:ascii="Calibri" w:cs="Calibri"/>
         </w:rPr>
-        <w:t>View and sign their lease contract.</w:t>
+        <w:drawing>
+          <wp:inline distT="0" distB="0" distL="0" distR="0" wp14:anchorId="33DA39CE" wp14:editId="657D4D30">
+            <wp:extent cx="5943600" cy="2848610"/>
+            <wp:effectExtent l="0" t="0" r="0" b="0"/>
+            <wp:docPr id="802895103" name="Picture 1"/>
+            <wp:cNvGraphicFramePr>
+              <a:graphicFrameLocks xmlns:a="http://schemas.openxmlformats.org/drawingml/2006/main" noChangeAspect="1"/>
+            </wp:cNvGraphicFramePr>
+            <a:graphic xmlns:a="http://schemas.openxmlformats.org/drawingml/2006/main">
+              <a:graphicData uri="http://schemas.openxmlformats.org/drawingml/2006/picture">
+                <pic:pic xmlns:pic="http://schemas.openxmlformats.org/drawingml/2006/picture">
+                  <pic:nvPicPr>
+                    <pic:cNvPr id="802895103" name=""/>
+                    <pic:cNvPicPr/>
+                  </pic:nvPicPr>
+                  <pic:blipFill>
+                    <a:blip r:embed="rId32"/>
+                    <a:stretch>
+                      <a:fillRect/>
+                    </a:stretch>
+                  </pic:blipFill>
+                  <pic:spPr>
+                    <a:xfrm>
+                      <a:off x="0" y="0"/>
+                      <a:ext cx="5943600" cy="2848610"/>
+                    </a:xfrm>
+                    <a:prstGeom prst="rect">
+                      <a:avLst/>
+                    </a:prstGeom>
+                  </pic:spPr>
+                </pic:pic>
+              </a:graphicData>
+            </a:graphic>
+          </wp:inline>
+        </w:drawing>
       </w:r>
     </w:p>
     <w:p>
@@ -2312,28 +3348,6 @@
           <w:rFonts w:ascii="Calibri" w:cs="Calibri"/>
         </w:rPr>
       </w:pPr>
-      <w:r>
-        <w:rPr>
-          <w:rFonts w:ascii="Calibri" w:cs="Calibri"/>
-        </w:rPr>
-        <w:t>Submit maintenance requests with photos.</w:t>
-      </w:r>
-    </w:p>
-    <w:p>
-      <w:pPr>
-        <w:shd w:val="clear" w:color="auto" w:fill="FFF3CD"/>
-        <w:rPr>
-          <w:rFonts w:cs="Calibri"/>
-        </w:rPr>
-      </w:pPr>
-      <w:r>
-        <w:rPr>
-          <w:rFonts w:cs="Calibri"/>
-          <w:b/>
-          <w:color w:val="856404"/>
-        </w:rPr>
-        <w:t>[Screenshot: Tenant portal dashboard showing balance and pay button]</w:t>
-      </w:r>
     </w:p>
     <w:p>
       <w:pPr>
@@ -2346,7 +3360,217 @@
         <w:rPr>
           <w:rFonts w:cs="Calibri"/>
         </w:rPr>
-        <w:t>10. Reports and finance</w:t>
+        <w:t>12. Settings</w:t>
+      </w:r>
+    </w:p>
+    <w:p>
+      <w:pPr>
+        <w:pStyle w:val="ListBullet"/>
+        <w:rPr>
+          <w:rFonts w:ascii="Calibri" w:cs="Calibri"/>
+        </w:rPr>
+      </w:pPr>
+      <w:r>
+        <w:rPr>
+          <w:rFonts w:ascii="Calibri" w:cs="Calibri"/>
+        </w:rPr>
+        <w:lastRenderedPageBreak/>
+        <w:t>Business name — shown on contracts instead of your personal name.</w:t>
+      </w:r>
+    </w:p>
+    <w:p>
+      <w:pPr>
+        <w:pStyle w:val="ListBullet"/>
+        <w:rPr>
+          <w:rFonts w:ascii="Calibri" w:cs="Calibri"/>
+        </w:rPr>
+      </w:pPr>
+      <w:r>
+        <w:rPr>
+          <w:rFonts w:ascii="Calibri" w:cs="Calibri"/>
+        </w:rPr>
+        <w:t>GCash details — wallet number and name shown to tenants.</w:t>
+      </w:r>
+    </w:p>
+    <w:p>
+      <w:pPr>
+        <w:pStyle w:val="ListBullet"/>
+        <w:rPr>
+          <w:rFonts w:ascii="Calibri" w:cs="Calibri"/>
+        </w:rPr>
+      </w:pPr>
+      <w:r>
+        <w:rPr>
+          <w:rFonts w:ascii="Calibri" w:cs="Calibri"/>
+        </w:rPr>
+        <w:t>Bank accounts — accounts tenants can transfer rent to.</w:t>
+      </w:r>
+    </w:p>
+    <w:p>
+      <w:pPr>
+        <w:pStyle w:val="ListBullet"/>
+        <w:rPr>
+          <w:rFonts w:ascii="Calibri" w:cs="Calibri"/>
+        </w:rPr>
+      </w:pPr>
+      <w:r>
+        <w:rPr>
+          <w:rFonts w:ascii="Calibri" w:cs="Calibri"/>
+        </w:rPr>
+        <w:t>Portfolio members — invite co-owners or managers.</w:t>
+      </w:r>
+    </w:p>
+    <w:p>
+      <w:pPr>
+        <w:pStyle w:val="ListBullet"/>
+        <w:rPr>
+          <w:rFonts w:ascii="Calibri" w:cs="Calibri"/>
+        </w:rPr>
+      </w:pPr>
+      <w:r>
+        <w:rPr>
+          <w:rFonts w:ascii="Calibri" w:cs="Calibri"/>
+        </w:rPr>
+        <w:t>Custom fields — extra details on properties, leases, and tenants.</w:t>
+      </w:r>
+    </w:p>
+    <w:p>
+      <w:pPr>
+        <w:pStyle w:val="ListBullet"/>
+        <w:rPr>
+          <w:rFonts w:ascii="Calibri" w:cs="Calibri"/>
+        </w:rPr>
+      </w:pPr>
+      <w:r>
+        <w:rPr>
+          <w:rFonts w:ascii="Calibri" w:cs="Calibri"/>
+        </w:rPr>
+        <w:t>Email delivery — test your email transport (Gmail or Resend).</w:t>
+      </w:r>
+    </w:p>
+    <w:p>
+      <w:pPr>
+        <w:pStyle w:val="ListBullet"/>
+        <w:rPr>
+          <w:rFonts w:ascii="Calibri" w:cs="Calibri"/>
+        </w:rPr>
+      </w:pPr>
+      <w:r>
+        <w:rPr>
+          <w:rFonts w:ascii="Calibri" w:cs="Calibri"/>
+        </w:rPr>
+        <w:t>Sign-in — connect or disconnect Google sign-in.</w:t>
+      </w:r>
+    </w:p>
+    <w:p>
+      <w:pPr>
+        <w:pStyle w:val="ListBullet"/>
+        <w:rPr>
+          <w:rFonts w:ascii="Calibri" w:cs="Calibri"/>
+        </w:rPr>
+      </w:pPr>
+      <w:r>
+        <w:rPr>
+          <w:rFonts w:ascii="Calibri" w:cs="Calibri"/>
+        </w:rPr>
+        <w:drawing>
+          <wp:inline distT="0" distB="0" distL="0" distR="0" wp14:anchorId="26BDD2B2" wp14:editId="13DC7187">
+            <wp:extent cx="5943600" cy="4287520"/>
+            <wp:effectExtent l="0" t="0" r="0" b="0"/>
+            <wp:docPr id="513838305" name="Picture 1"/>
+            <wp:cNvGraphicFramePr>
+              <a:graphicFrameLocks xmlns:a="http://schemas.openxmlformats.org/drawingml/2006/main" noChangeAspect="1"/>
+            </wp:cNvGraphicFramePr>
+            <a:graphic xmlns:a="http://schemas.openxmlformats.org/drawingml/2006/main">
+              <a:graphicData uri="http://schemas.openxmlformats.org/drawingml/2006/picture">
+                <pic:pic xmlns:pic="http://schemas.openxmlformats.org/drawingml/2006/picture">
+                  <pic:nvPicPr>
+                    <pic:cNvPr id="513838305" name=""/>
+                    <pic:cNvPicPr/>
+                  </pic:nvPicPr>
+                  <pic:blipFill>
+                    <a:blip r:embed="rId33"/>
+                    <a:stretch>
+                      <a:fillRect/>
+                    </a:stretch>
+                  </pic:blipFill>
+                  <pic:spPr>
+                    <a:xfrm>
+                      <a:off x="0" y="0"/>
+                      <a:ext cx="5943600" cy="4287520"/>
+                    </a:xfrm>
+                    <a:prstGeom prst="rect">
+                      <a:avLst/>
+                    </a:prstGeom>
+                  </pic:spPr>
+                </pic:pic>
+              </a:graphicData>
+            </a:graphic>
+          </wp:inline>
+        </w:drawing>
+      </w:r>
+    </w:p>
+    <w:p>
+      <w:pPr>
+        <w:pStyle w:val="ListBullet"/>
+        <w:rPr>
+          <w:rFonts w:ascii="Calibri" w:cs="Calibri"/>
+        </w:rPr>
+      </w:pPr>
+      <w:r>
+        <w:rPr>
+          <w:rFonts w:ascii="Calibri" w:cs="Calibri"/>
+        </w:rPr>
+        <w:lastRenderedPageBreak/>
+        <w:drawing>
+          <wp:inline distT="0" distB="0" distL="0" distR="0" wp14:anchorId="2E28456D" wp14:editId="09E4B41B">
+            <wp:extent cx="5943600" cy="4288155"/>
+            <wp:effectExtent l="0" t="0" r="0" b="0"/>
+            <wp:docPr id="470995956" name="Picture 1"/>
+            <wp:cNvGraphicFramePr>
+              <a:graphicFrameLocks xmlns:a="http://schemas.openxmlformats.org/drawingml/2006/main" noChangeAspect="1"/>
+            </wp:cNvGraphicFramePr>
+            <a:graphic xmlns:a="http://schemas.openxmlformats.org/drawingml/2006/main">
+              <a:graphicData uri="http://schemas.openxmlformats.org/drawingml/2006/picture">
+                <pic:pic xmlns:pic="http://schemas.openxmlformats.org/drawingml/2006/picture">
+                  <pic:nvPicPr>
+                    <pic:cNvPr id="470995956" name=""/>
+                    <pic:cNvPicPr/>
+                  </pic:nvPicPr>
+                  <pic:blipFill>
+                    <a:blip r:embed="rId34"/>
+                    <a:stretch>
+                      <a:fillRect/>
+                    </a:stretch>
+                  </pic:blipFill>
+                  <pic:spPr>
+                    <a:xfrm>
+                      <a:off x="0" y="0"/>
+                      <a:ext cx="5943600" cy="4288155"/>
+                    </a:xfrm>
+                    <a:prstGeom prst="rect">
+                      <a:avLst/>
+                    </a:prstGeom>
+                  </pic:spPr>
+                </pic:pic>
+              </a:graphicData>
+            </a:graphic>
+          </wp:inline>
+        </w:drawing>
+      </w:r>
+    </w:p>
+    <w:p>
+      <w:pPr>
+        <w:pStyle w:val="Heading2"/>
+        <w:rPr>
+          <w:rFonts w:cs="Calibri"/>
+        </w:rPr>
+      </w:pPr>
+      <w:r>
+        <w:rPr>
+          <w:rFonts w:cs="Calibri"/>
+        </w:rPr>
+        <w:t>13. Troubleshooting</w:t>
       </w:r>
     </w:p>
     <w:p>
@@ -2360,37 +3584,20 @@
         <w:rPr>
           <w:rFonts w:cs="Calibri"/>
         </w:rPr>
-        <w:t>10.1 Finance page</w:t>
-      </w:r>
-    </w:p>
-    <w:p>
-      <w:pPr>
-        <w:rPr>
-          <w:rFonts w:cs="Calibri"/>
-        </w:rPr>
-      </w:pPr>
-      <w:r>
-        <w:rPr>
-          <w:rFonts w:cs="Calibri"/>
-        </w:rPr>
-        <w:t>The Finance page shows all payments and expenses, with filters by property. You can record payments, verify pending submissions, and manage expenses.</w:t>
-      </w:r>
-    </w:p>
-    <w:p>
-      <w:pPr>
-        <w:shd w:val="clear" w:color="auto" w:fill="FFF3CD"/>
-        <w:rPr>
-          <w:rFonts w:cs="Calibri"/>
-        </w:rPr>
-      </w:pPr>
-      <w:r>
-        <w:rPr>
-          <w:rFonts w:cs="Calibri"/>
-          <w:b/>
-          <w:color w:val="856404"/>
-        </w:rPr>
-        <w:lastRenderedPageBreak/>
-        <w:t>[Screenshot: Finance page with payments and expenses tabs]</w:t>
+        <w:t>I can't receive emails</w:t>
+      </w:r>
+    </w:p>
+    <w:p>
+      <w:pPr>
+        <w:rPr>
+          <w:rFonts w:cs="Calibri"/>
+        </w:rPr>
+      </w:pPr>
+      <w:r>
+        <w:rPr>
+          <w:rFonts w:cs="Calibri"/>
+        </w:rPr>
+        <w:t>Check Settings → Email delivery and send a test email. If using Resend, verify your domain in the Resend dashboard.</w:t>
       </w:r>
     </w:p>
     <w:p>
@@ -2404,345 +3611,6 @@
         <w:rPr>
           <w:rFonts w:cs="Calibri"/>
         </w:rPr>
-        <w:t>10.2 Reports</w:t>
-      </w:r>
-    </w:p>
-    <w:p>
-      <w:pPr>
-        <w:rPr>
-          <w:rFonts w:cs="Calibri"/>
-        </w:rPr>
-      </w:pPr>
-      <w:r>
-        <w:rPr>
-          <w:rFonts w:cs="Calibri"/>
-        </w:rPr>
-        <w:t>Three reports are available, exportable as CSV:</w:t>
-      </w:r>
-    </w:p>
-    <w:p>
-      <w:pPr>
-        <w:pStyle w:val="ListBullet"/>
-        <w:rPr>
-          <w:rFonts w:ascii="Calibri" w:cs="Calibri"/>
-        </w:rPr>
-      </w:pPr>
-      <w:r>
-        <w:rPr>
-          <w:rFonts w:ascii="Calibri" w:cs="Calibri"/>
-        </w:rPr>
-        <w:t>Cash flow — income vs. expenses per month.</w:t>
-      </w:r>
-    </w:p>
-    <w:p>
-      <w:pPr>
-        <w:pStyle w:val="ListBullet"/>
-        <w:rPr>
-          <w:rFonts w:ascii="Calibri" w:cs="Calibri"/>
-        </w:rPr>
-      </w:pPr>
-      <w:r>
-        <w:rPr>
-          <w:rFonts w:ascii="Calibri" w:cs="Calibri"/>
-        </w:rPr>
-        <w:t>Profit &amp; loss — per property.</w:t>
-      </w:r>
-    </w:p>
-    <w:p>
-      <w:pPr>
-        <w:pStyle w:val="ListBullet"/>
-        <w:rPr>
-          <w:rFonts w:ascii="Calibri" w:cs="Calibri"/>
-        </w:rPr>
-      </w:pPr>
-      <w:r>
-        <w:rPr>
-          <w:rFonts w:ascii="Calibri" w:cs="Calibri"/>
-        </w:rPr>
-        <w:t>Occupancy — occupied units vs. total per month.</w:t>
-      </w:r>
-    </w:p>
-    <w:p>
-      <w:pPr>
-        <w:shd w:val="clear" w:color="auto" w:fill="FFF3CD"/>
-        <w:rPr>
-          <w:rFonts w:cs="Calibri"/>
-        </w:rPr>
-      </w:pPr>
-      <w:r>
-        <w:rPr>
-          <w:rFonts w:cs="Calibri"/>
-          <w:b/>
-          <w:color w:val="856404"/>
-        </w:rPr>
-        <w:t>[Screenshot: Reports page with report type selector and CSV export]</w:t>
-      </w:r>
-    </w:p>
-    <w:p>
-      <w:pPr>
-        <w:pStyle w:val="Heading2"/>
-        <w:rPr>
-          <w:rFonts w:cs="Calibri"/>
-        </w:rPr>
-      </w:pPr>
-      <w:r>
-        <w:rPr>
-          <w:rFonts w:cs="Calibri"/>
-        </w:rPr>
-        <w:t>11. Referrals</w:t>
-      </w:r>
-    </w:p>
-    <w:p>
-      <w:pPr>
-        <w:rPr>
-          <w:rFonts w:cs="Calibri"/>
-        </w:rPr>
-      </w:pPr>
-      <w:r>
-        <w:rPr>
-          <w:rFonts w:cs="Calibri"/>
-        </w:rPr>
-        <w:t>Every landlord gets a referral link. When someone signs up using your link and becomes a paying customer, you earn a bounty.</w:t>
-      </w:r>
-    </w:p>
-    <w:p>
-      <w:pPr>
-        <w:pStyle w:val="ListBullet"/>
-        <w:rPr>
-          <w:rFonts w:ascii="Calibri" w:cs="Calibri"/>
-        </w:rPr>
-      </w:pPr>
-      <w:r>
-        <w:rPr>
-          <w:rFonts w:ascii="Calibri" w:cs="Calibri"/>
-        </w:rPr>
-        <w:t>Share your link from the "Referrals" page.</w:t>
-      </w:r>
-    </w:p>
-    <w:p>
-      <w:pPr>
-        <w:pStyle w:val="ListBullet"/>
-        <w:rPr>
-          <w:rFonts w:ascii="Calibri" w:cs="Calibri"/>
-        </w:rPr>
-      </w:pPr>
-      <w:r>
-        <w:rPr>
-          <w:rFonts w:ascii="Calibri" w:cs="Calibri"/>
-        </w:rPr>
-        <w:t>Track signups and earnings.</w:t>
-      </w:r>
-    </w:p>
-    <w:p>
-      <w:pPr>
-        <w:pStyle w:val="ListBullet"/>
-        <w:rPr>
-          <w:rFonts w:ascii="Calibri" w:cs="Calibri"/>
-        </w:rPr>
-      </w:pPr>
-      <w:r>
-        <w:rPr>
-          <w:rFonts w:ascii="Calibri" w:cs="Calibri"/>
-        </w:rPr>
-        <w:t>Bounties are paid via GCash or bank transfer after a 30-day waiting period.</w:t>
-      </w:r>
-    </w:p>
-    <w:p>
-      <w:pPr>
-        <w:shd w:val="clear" w:color="auto" w:fill="FFF3CD"/>
-        <w:rPr>
-          <w:rFonts w:cs="Calibri"/>
-        </w:rPr>
-      </w:pPr>
-      <w:r>
-        <w:rPr>
-          <w:rFonts w:cs="Calibri"/>
-          <w:b/>
-          <w:color w:val="856404"/>
-        </w:rPr>
-        <w:t>[Screenshot: Referrals page with link card and earnings summary]</w:t>
-      </w:r>
-    </w:p>
-    <w:p>
-      <w:pPr>
-        <w:pStyle w:val="Heading2"/>
-        <w:rPr>
-          <w:rFonts w:cs="Calibri"/>
-        </w:rPr>
-      </w:pPr>
-      <w:r>
-        <w:rPr>
-          <w:rFonts w:cs="Calibri"/>
-        </w:rPr>
-        <w:t>12. Settings</w:t>
-      </w:r>
-    </w:p>
-    <w:p>
-      <w:pPr>
-        <w:pStyle w:val="ListBullet"/>
-        <w:rPr>
-          <w:rFonts w:ascii="Calibri" w:cs="Calibri"/>
-        </w:rPr>
-      </w:pPr>
-      <w:r>
-        <w:rPr>
-          <w:rFonts w:ascii="Calibri" w:cs="Calibri"/>
-        </w:rPr>
-        <w:t>Business name — shown on contracts instead of your personal name.</w:t>
-      </w:r>
-    </w:p>
-    <w:p>
-      <w:pPr>
-        <w:pStyle w:val="ListBullet"/>
-        <w:rPr>
-          <w:rFonts w:ascii="Calibri" w:cs="Calibri"/>
-        </w:rPr>
-      </w:pPr>
-      <w:r>
-        <w:rPr>
-          <w:rFonts w:ascii="Calibri" w:cs="Calibri"/>
-        </w:rPr>
-        <w:t>GCash details — wallet number and name shown to tenants.</w:t>
-      </w:r>
-    </w:p>
-    <w:p>
-      <w:pPr>
-        <w:pStyle w:val="ListBullet"/>
-        <w:rPr>
-          <w:rFonts w:ascii="Calibri" w:cs="Calibri"/>
-        </w:rPr>
-      </w:pPr>
-      <w:r>
-        <w:rPr>
-          <w:rFonts w:ascii="Calibri" w:cs="Calibri"/>
-        </w:rPr>
-        <w:t>Bank accounts — accounts tenants can transfer rent to.</w:t>
-      </w:r>
-    </w:p>
-    <w:p>
-      <w:pPr>
-        <w:pStyle w:val="ListBullet"/>
-        <w:rPr>
-          <w:rFonts w:ascii="Calibri" w:cs="Calibri"/>
-        </w:rPr>
-      </w:pPr>
-      <w:r>
-        <w:rPr>
-          <w:rFonts w:ascii="Calibri" w:cs="Calibri"/>
-        </w:rPr>
-        <w:t>Portfolio members — invite co-owners or managers.</w:t>
-      </w:r>
-    </w:p>
-    <w:p>
-      <w:pPr>
-        <w:pStyle w:val="ListBullet"/>
-        <w:rPr>
-          <w:rFonts w:ascii="Calibri" w:cs="Calibri"/>
-        </w:rPr>
-      </w:pPr>
-      <w:r>
-        <w:rPr>
-          <w:rFonts w:ascii="Calibri" w:cs="Calibri"/>
-        </w:rPr>
-        <w:t>Custom fields — extra details on properties, leases, and tenants.</w:t>
-      </w:r>
-    </w:p>
-    <w:p>
-      <w:pPr>
-        <w:pStyle w:val="ListBullet"/>
-        <w:rPr>
-          <w:rFonts w:ascii="Calibri" w:cs="Calibri"/>
-        </w:rPr>
-      </w:pPr>
-      <w:r>
-        <w:rPr>
-          <w:rFonts w:ascii="Calibri" w:cs="Calibri"/>
-        </w:rPr>
-        <w:t>Email delivery — test your email transport (Gmail or Resend).</w:t>
-      </w:r>
-    </w:p>
-    <w:p>
-      <w:pPr>
-        <w:pStyle w:val="ListBullet"/>
-        <w:rPr>
-          <w:rFonts w:ascii="Calibri" w:cs="Calibri"/>
-        </w:rPr>
-      </w:pPr>
-      <w:r>
-        <w:rPr>
-          <w:rFonts w:ascii="Calibri" w:cs="Calibri"/>
-        </w:rPr>
-        <w:t>Sign-in — connect or disconnect Google sign-in.</w:t>
-      </w:r>
-    </w:p>
-    <w:p>
-      <w:pPr>
-        <w:shd w:val="clear" w:color="auto" w:fill="FFF3CD"/>
-        <w:rPr>
-          <w:rFonts w:cs="Calibri"/>
-        </w:rPr>
-      </w:pPr>
-      <w:r>
-        <w:rPr>
-          <w:rFonts w:cs="Calibri"/>
-          <w:b/>
-          <w:color w:val="856404"/>
-        </w:rPr>
-        <w:t>[Screenshot: Settings page with all cards]</w:t>
-      </w:r>
-    </w:p>
-    <w:p>
-      <w:pPr>
-        <w:pStyle w:val="Heading2"/>
-        <w:rPr>
-          <w:rFonts w:cs="Calibri"/>
-        </w:rPr>
-      </w:pPr>
-      <w:r>
-        <w:rPr>
-          <w:rFonts w:cs="Calibri"/>
-        </w:rPr>
-        <w:t>13. Troubleshooting</w:t>
-      </w:r>
-    </w:p>
-    <w:p>
-      <w:pPr>
-        <w:pStyle w:val="Heading3"/>
-        <w:rPr>
-          <w:rFonts w:cs="Calibri"/>
-        </w:rPr>
-      </w:pPr>
-      <w:r>
-        <w:rPr>
-          <w:rFonts w:cs="Calibri"/>
-        </w:rPr>
-        <w:t>I can't receive emails</w:t>
-      </w:r>
-    </w:p>
-    <w:p>
-      <w:pPr>
-        <w:rPr>
-          <w:rFonts w:cs="Calibri"/>
-        </w:rPr>
-      </w:pPr>
-      <w:r>
-        <w:rPr>
-          <w:rFonts w:cs="Calibri"/>
-        </w:rPr>
-        <w:t>Check Settings → Email delivery and send a test email. If using Resend, verify your domain in the Resend dashboard.</w:t>
-      </w:r>
-    </w:p>
-    <w:p>
-      <w:pPr>
-        <w:pStyle w:val="Heading3"/>
-        <w:rPr>
-          <w:rFonts w:cs="Calibri"/>
-        </w:rPr>
-      </w:pPr>
-      <w:r>
-        <w:rPr>
-          <w:rFonts w:cs="Calibri"/>
-        </w:rPr>
         <w:t>A tenant's payment isn't showing</w:t>
       </w:r>
     </w:p>
@@ -2756,7 +3624,6 @@
         <w:rPr>
           <w:rFonts w:cs="Calibri"/>
         </w:rPr>
-        <w:lastRenderedPageBreak/>
         <w:t>GCash/bank transfer payments submitted through the portal appear as "Pending" until you verify them. Check Finance → pending payments.</w:t>
       </w:r>
     </w:p>

</xml_diff>